<commit_message>
Update: Analysis hypothesis 1 - DONE
</commit_message>
<xml_diff>
--- a/reports/final_report/hypothesis_01_report.docx
+++ b/reports/final_report/hypothesis_01_report.docx
@@ -786,6 +786,45 @@
         <w:pStyle w:val="Heading1"/>
       </w:pPr>
       <w:r>
+        <w:t>Decision rules</w:t>
+      </w:r>
+    </w:p>
+    <w:p>
+      <w:r>
+        <w:br/>
+        <w:t>H1 supported</w:t>
+        <w:br/>
+        <w:t xml:space="preserve">    if there is clear evidence of differences</w:t>
+        <w:br/>
+        <w:t xml:space="preserve">    between emotional conditions in accuracy,</w:t>
+        <w:br/>
+        <w:t xml:space="preserve">    RT, or both.</w:t>
+      </w:r>
+    </w:p>
+    <w:p>
+      <w:r>
+        <w:t>H1 partially supported</w:t>
+        <w:br/>
+        <w:t xml:space="preserve">    if differences arise in only one outcome</w:t>
+        <w:br/>
+        <w:t xml:space="preserve">    or in only one specific contrast.</w:t>
+      </w:r>
+    </w:p>
+    <w:p>
+      <w:r>
+        <w:t>H1 not supported</w:t>
+        <w:br/>
+        <w:t xml:space="preserve">    if there is no evidence of relevant differences</w:t>
+        <w:br/>
+        <w:t xml:space="preserve">    between conditions.</w:t>
+        <w:br/>
+      </w:r>
+    </w:p>
+    <w:p>
+      <w:pPr>
+        <w:pStyle w:val="Heading1"/>
+      </w:pPr>
+      <w:r>
         <w:t>Interpretation</w:t>
       </w:r>
     </w:p>

</xml_diff>

<commit_message>
Report: update infra report hypothesis 1- DONE
</commit_message>
<xml_diff>
--- a/reports/final_report/hypothesis_01_report.docx
+++ b/reports/final_report/hypothesis_01_report.docx
@@ -19,7 +19,6 @@
         <w:t>Confirmatory Hypothesis Report</w:t>
       </w:r>
     </w:p>
-    <w:p/>
     <w:p>
       <w:pPr>
         <w:pStyle w:val="Heading1"/>
@@ -43,54 +42,22 @@
     </w:p>
     <w:p>
       <w:r>
-        <w:t>A trial-level confirmatory analysis was conducted to evaluate whether</w:t>
-        <w:br/>
-        <w:t>working-memory performance differed across neutral, positive, and negative</w:t>
-        <w:br/>
-        <w:t>emotional conditions. The analytical sample included 23 participants.</w:t>
+        <w:t>A trial-level confirmatory analysis was conducted to evaluate whether working-memory performance differed across neutral, positive, and negative emotional conditions. The analytical sample included 23 participants.</w:t>
       </w:r>
     </w:p>
     <w:p>
       <w:r>
-        <w:t>Response accuracy was analyzed using a generalized estimating equation</w:t>
-        <w:br/>
-        <w:t>(GEE) model with a binomial distribution, logit link, exchangeable</w:t>
-        <w:br/>
-        <w:t>within-participant correlation structure, and robust standard errors.</w:t>
-        <w:br/>
-        <w:t>Emotional condition was entered as the primary predictor, with the neutral</w:t>
-        <w:br/>
-        <w:t>condition specified as the reference category. The accuracy model included</w:t>
-        <w:br/>
-        <w:t>17,820 trial-level observations clustered within 23 participants.</w:t>
+        <w:t>Response accuracy was analyzed using a generalized estimating equation (GEE) model with a binomial distribution, logit link, exchangeable within-participant correlation structure, and robust standard errors. Emotional condition was entered as the primary predictor, with the neutral condition specified as the reference category. The accuracy model included 17,820 trial-level observations.</w:t>
       </w:r>
     </w:p>
     <w:p>
       <w:r>
-        <w:t>Reaction time was analyzed among valid correct-response trials only.</w:t>
-        <w:br/>
-        <w:t>Because reaction-time data were positively skewed, reaction time was</w:t>
-        <w:br/>
-        <w:t>log-transformed prior to modeling. A linear mixed-effects model was fitted</w:t>
-        <w:br/>
-        <w:t>with emotional condition as a fixed effect and a participant-specific</w:t>
-        <w:br/>
-        <w:t>random intercept. The reaction-time analysis included 14,184 observations</w:t>
-        <w:br/>
-        <w:t>from 23 participants. Maximum-likelihood estimation was used.</w:t>
+        <w:t>Reaction time was analyzed among valid correct-response trials only. Because reaction-time data were positively skewed, reaction time was log-transformed prior to modeling. A linear mixed-effects model was fitted with emotional condition as a fixed effect and a participant-specific random intercept. The reaction-time analysis included 14,184 observations. Maximum-likelihood estimation was used.</w:t>
       </w:r>
     </w:p>
     <w:p>
       <w:r>
-        <w:t>Model coefficients from the binomial GEE were exponentiated and interpreted</w:t>
-        <w:br/>
-        <w:t>as odds ratios. Coefficients from the log reaction-time model were</w:t>
-        <w:br/>
-        <w:t>exponentiated and converted to percentage changes relative to the neutral</w:t>
-        <w:br/>
-        <w:t>condition. Statistical significance was evaluated using a two-sided alpha</w:t>
-        <w:br/>
-        <w:t>level of .05, and 95% confidence intervals are reported.</w:t>
+        <w:t>Model coefficients from the binomial GEE were exponentiated and interpreted as odds ratios. Coefficients from the log reaction-time model were exponentiated and converted to percentage changes relative to the neutral condition. Statistical significance was evaluated using a two-sided alpha level of .05, and 95% confidence intervals are reported.</w:t>
       </w:r>
     </w:p>
     <w:p>
@@ -111,54 +78,387 @@
     </w:p>
     <w:p>
       <w:r>
-        <w:t>Descriptively, accuracy was highly similar across emotional conditions.</w:t>
-        <w:br/>
-        <w:t>Mean trial-level accuracy was 83.8% in the negative condition, 85.0% in</w:t>
-        <w:br/>
-        <w:t>the neutral condition, and 85.1% in the positive condition.</w:t>
+        <w:t>Descriptively, accuracy was highly similar across emotional conditions. Mean trial-level accuracy was 83.8% in the negative condition, 85.0% in the neutral condition, and 85.1% in the positive condition.</w:t>
       </w:r>
     </w:p>
     <w:p>
       <w:r>
-        <w:t>The omnibus Wald test indicated that emotional condition was not</w:t>
-        <w:br/>
-        <w:t>significantly associated with response accuracy,</w:t>
-        <w:br/>
-        <w:t>chi-square(2) = 2.54, p = .281.</w:t>
+        <w:t>Relative to the neutral condition, the negative condition was associated with a small, non-significant reduction in the odds of a correct response (beta = -0.084, SE = 0.064, z = -1.31, p = .189), corresponding to an odds ratio of 0.92 (95% CI [0.81, 1.04]).</w:t>
       </w:r>
     </w:p>
     <w:p>
       <w:r>
-        <w:t>Relative to the neutral condition, the negative condition was associated</w:t>
-        <w:br/>
-        <w:t>with a small, non-significant reduction in the odds of a correct response</w:t>
-        <w:br/>
-        <w:t>(beta = -0.084, SE = 0.064, z = -1.31, p = .189), corresponding to an</w:t>
-        <w:br/>
-        <w:t>odds ratio of approximately 0.92 (95% CI [0.81, 1.04]).</w:t>
+        <w:t>The positive condition did not differ significantly from the neutral condition (beta = 0.002, SE = 0.057, z = 0.03, p = .979), with an odds ratio of 1.00 (95% CI [0.90, 1.12]).</w:t>
       </w:r>
     </w:p>
     <w:p>
       <w:r>
-        <w:t>The positive condition did not differ from the neutral condition</w:t>
-        <w:br/>
-        <w:t>(beta = 0.002, SE = 0.057, z = 0.03, p = .979), with an odds ratio of</w:t>
-        <w:br/>
-        <w:t>approximately 1.00 (95% CI [0.90, 1.12]).</w:t>
-      </w:r>
-    </w:p>
-    <w:p>
-      <w:r>
-        <w:t>Taken together, these findings provide no evidence that emotional</w:t>
-        <w:br/>
-        <w:t>condition substantially altered the probability of producing a correct</w:t>
-        <w:br/>
-        <w:t>response.</w:t>
+        <w:t>Taken together, these findings provide no evidence that emotional condition substantially altered the probability of producing a correct response.</w:t>
       </w:r>
     </w:p>
     <w:p>
       <w:r>
         <w:t>Table 1. Descriptive accuracy by emotional condition.</w:t>
+      </w:r>
+    </w:p>
+    <w:tbl>
+      <w:tblPr>
+        <w:tblStyle w:val="TableGrid"/>
+        <w:tblW w:type="auto" w:w="0"/>
+        <w:jc w:val="center"/>
+        <w:tblLook w:firstColumn="1" w:firstRow="1" w:lastColumn="0" w:lastRow="0" w:noHBand="0" w:noVBand="1" w:val="04A0"/>
+      </w:tblPr>
+      <w:tblGrid>
+        <w:gridCol w:w="1378"/>
+        <w:gridCol w:w="1378"/>
+        <w:gridCol w:w="1378"/>
+        <w:gridCol w:w="1378"/>
+        <w:gridCol w:w="1378"/>
+        <w:gridCol w:w="1378"/>
+        <w:gridCol w:w="1378"/>
+      </w:tblGrid>
+      <w:tr>
+        <w:tc>
+          <w:tcPr>
+            <w:tcW w:type="dxa" w:w="1378"/>
+            <w:vAlign w:val="center"/>
+          </w:tcPr>
+          <w:p>
+            <w:r>
+              <w:rPr>
+                <w:b/>
+              </w:rPr>
+              <w:t>Condition</w:t>
+            </w:r>
+          </w:p>
+        </w:tc>
+        <w:tc>
+          <w:tcPr>
+            <w:tcW w:type="dxa" w:w="1378"/>
+            <w:vAlign w:val="center"/>
+          </w:tcPr>
+          <w:p>
+            <w:r>
+              <w:rPr>
+                <w:b/>
+              </w:rPr>
+              <w:t>Participants</w:t>
+            </w:r>
+          </w:p>
+        </w:tc>
+        <w:tc>
+          <w:tcPr>
+            <w:tcW w:type="dxa" w:w="1378"/>
+            <w:vAlign w:val="center"/>
+          </w:tcPr>
+          <w:p>
+            <w:r>
+              <w:rPr>
+                <w:b/>
+              </w:rPr>
+              <w:t>Trials</w:t>
+            </w:r>
+          </w:p>
+        </w:tc>
+        <w:tc>
+          <w:tcPr>
+            <w:tcW w:type="dxa" w:w="1378"/>
+            <w:vAlign w:val="center"/>
+          </w:tcPr>
+          <w:p>
+            <w:r>
+              <w:rPr>
+                <w:b/>
+              </w:rPr>
+              <w:t>correct</w:t>
+            </w:r>
+          </w:p>
+        </w:tc>
+        <w:tc>
+          <w:tcPr>
+            <w:tcW w:type="dxa" w:w="1378"/>
+            <w:vAlign w:val="center"/>
+          </w:tcPr>
+          <w:p>
+            <w:r>
+              <w:rPr>
+                <w:b/>
+              </w:rPr>
+              <w:t>Accuracy</w:t>
+            </w:r>
+          </w:p>
+        </w:tc>
+        <w:tc>
+          <w:tcPr>
+            <w:tcW w:type="dxa" w:w="1378"/>
+            <w:vAlign w:val="center"/>
+          </w:tcPr>
+          <w:p>
+            <w:r>
+              <w:rPr>
+                <w:b/>
+              </w:rPr>
+              <w:t>SD</w:t>
+            </w:r>
+          </w:p>
+        </w:tc>
+        <w:tc>
+          <w:tcPr>
+            <w:tcW w:type="dxa" w:w="1378"/>
+            <w:vAlign w:val="center"/>
+          </w:tcPr>
+          <w:p>
+            <w:r>
+              <w:rPr>
+                <w:b/>
+              </w:rPr>
+              <w:t>Median</w:t>
+            </w:r>
+          </w:p>
+        </w:tc>
+      </w:tr>
+      <w:tr>
+        <w:tc>
+          <w:tcPr>
+            <w:tcW w:type="dxa" w:w="1378"/>
+            <w:vAlign w:val="center"/>
+          </w:tcPr>
+          <w:p>
+            <w:r>
+              <w:t>Negative</w:t>
+            </w:r>
+          </w:p>
+        </w:tc>
+        <w:tc>
+          <w:tcPr>
+            <w:tcW w:type="dxa" w:w="1378"/>
+            <w:vAlign w:val="center"/>
+          </w:tcPr>
+          <w:p>
+            <w:r>
+              <w:t>22</w:t>
+            </w:r>
+          </w:p>
+        </w:tc>
+        <w:tc>
+          <w:tcPr>
+            <w:tcW w:type="dxa" w:w="1378"/>
+            <w:vAlign w:val="center"/>
+          </w:tcPr>
+          <w:p>
+            <w:r>
+              <w:t>5940</w:t>
+            </w:r>
+          </w:p>
+        </w:tc>
+        <w:tc>
+          <w:tcPr>
+            <w:tcW w:type="dxa" w:w="1378"/>
+            <w:vAlign w:val="center"/>
+          </w:tcPr>
+          <w:p>
+            <w:r>
+              <w:t>4978</w:t>
+            </w:r>
+          </w:p>
+        </w:tc>
+        <w:tc>
+          <w:tcPr>
+            <w:tcW w:type="dxa" w:w="1378"/>
+            <w:vAlign w:val="center"/>
+          </w:tcPr>
+          <w:p>
+            <w:r>
+              <w:t>83.8%</w:t>
+            </w:r>
+          </w:p>
+        </w:tc>
+        <w:tc>
+          <w:tcPr>
+            <w:tcW w:type="dxa" w:w="1378"/>
+            <w:vAlign w:val="center"/>
+          </w:tcPr>
+          <w:p>
+            <w:r>
+              <w:t>0.368</w:t>
+            </w:r>
+          </w:p>
+        </w:tc>
+        <w:tc>
+          <w:tcPr>
+            <w:tcW w:type="dxa" w:w="1378"/>
+            <w:vAlign w:val="center"/>
+          </w:tcPr>
+          <w:p>
+            <w:r>
+              <w:t>1.0</w:t>
+            </w:r>
+          </w:p>
+        </w:tc>
+      </w:tr>
+      <w:tr>
+        <w:tc>
+          <w:tcPr>
+            <w:tcW w:type="dxa" w:w="1378"/>
+            <w:vAlign w:val="center"/>
+          </w:tcPr>
+          <w:p>
+            <w:r>
+              <w:t>Neutral</w:t>
+            </w:r>
+          </w:p>
+        </w:tc>
+        <w:tc>
+          <w:tcPr>
+            <w:tcW w:type="dxa" w:w="1378"/>
+            <w:vAlign w:val="center"/>
+          </w:tcPr>
+          <w:p>
+            <w:r>
+              <w:t>23</w:t>
+            </w:r>
+          </w:p>
+        </w:tc>
+        <w:tc>
+          <w:tcPr>
+            <w:tcW w:type="dxa" w:w="1378"/>
+            <w:vAlign w:val="center"/>
+          </w:tcPr>
+          <w:p>
+            <w:r>
+              <w:t>5940</w:t>
+            </w:r>
+          </w:p>
+        </w:tc>
+        <w:tc>
+          <w:tcPr>
+            <w:tcW w:type="dxa" w:w="1378"/>
+            <w:vAlign w:val="center"/>
+          </w:tcPr>
+          <w:p>
+            <w:r>
+              <w:t>5049</w:t>
+            </w:r>
+          </w:p>
+        </w:tc>
+        <w:tc>
+          <w:tcPr>
+            <w:tcW w:type="dxa" w:w="1378"/>
+            <w:vAlign w:val="center"/>
+          </w:tcPr>
+          <w:p>
+            <w:r>
+              <w:t>85.0%</w:t>
+            </w:r>
+          </w:p>
+        </w:tc>
+        <w:tc>
+          <w:tcPr>
+            <w:tcW w:type="dxa" w:w="1378"/>
+            <w:vAlign w:val="center"/>
+          </w:tcPr>
+          <w:p>
+            <w:r>
+              <w:t>0.357</w:t>
+            </w:r>
+          </w:p>
+        </w:tc>
+        <w:tc>
+          <w:tcPr>
+            <w:tcW w:type="dxa" w:w="1378"/>
+            <w:vAlign w:val="center"/>
+          </w:tcPr>
+          <w:p>
+            <w:r>
+              <w:t>1.0</w:t>
+            </w:r>
+          </w:p>
+        </w:tc>
+      </w:tr>
+      <w:tr>
+        <w:tc>
+          <w:tcPr>
+            <w:tcW w:type="dxa" w:w="1378"/>
+            <w:vAlign w:val="center"/>
+          </w:tcPr>
+          <w:p>
+            <w:r>
+              <w:t>Positive</w:t>
+            </w:r>
+          </w:p>
+        </w:tc>
+        <w:tc>
+          <w:tcPr>
+            <w:tcW w:type="dxa" w:w="1378"/>
+            <w:vAlign w:val="center"/>
+          </w:tcPr>
+          <w:p>
+            <w:r>
+              <w:t>22</w:t>
+            </w:r>
+          </w:p>
+        </w:tc>
+        <w:tc>
+          <w:tcPr>
+            <w:tcW w:type="dxa" w:w="1378"/>
+            <w:vAlign w:val="center"/>
+          </w:tcPr>
+          <w:p>
+            <w:r>
+              <w:t>5940</w:t>
+            </w:r>
+          </w:p>
+        </w:tc>
+        <w:tc>
+          <w:tcPr>
+            <w:tcW w:type="dxa" w:w="1378"/>
+            <w:vAlign w:val="center"/>
+          </w:tcPr>
+          <w:p>
+            <w:r>
+              <w:t>5055</w:t>
+            </w:r>
+          </w:p>
+        </w:tc>
+        <w:tc>
+          <w:tcPr>
+            <w:tcW w:type="dxa" w:w="1378"/>
+            <w:vAlign w:val="center"/>
+          </w:tcPr>
+          <w:p>
+            <w:r>
+              <w:t>85.1%</w:t>
+            </w:r>
+          </w:p>
+        </w:tc>
+        <w:tc>
+          <w:tcPr>
+            <w:tcW w:type="dxa" w:w="1378"/>
+            <w:vAlign w:val="center"/>
+          </w:tcPr>
+          <w:p>
+            <w:r>
+              <w:t>0.356</w:t>
+            </w:r>
+          </w:p>
+        </w:tc>
+        <w:tc>
+          <w:tcPr>
+            <w:tcW w:type="dxa" w:w="1378"/>
+            <w:vAlign w:val="center"/>
+          </w:tcPr>
+          <w:p>
+            <w:r>
+              <w:t>1.0</w:t>
+            </w:r>
+          </w:p>
+        </w:tc>
+      </w:tr>
+    </w:tbl>
+    <w:p/>
+    <w:p>
+      <w:r>
+        <w:t>Table 2. GEE estimates for response accuracy.</w:t>
       </w:r>
     </w:p>
     <w:tbl>
@@ -178,40 +478,56 @@
         <w:tc>
           <w:tcPr>
             <w:tcW w:type="dxa" w:w="2412"/>
+            <w:vAlign w:val="center"/>
           </w:tcPr>
           <w:p>
             <w:r>
-              <w:t>Condition</w:t>
+              <w:rPr>
+                <w:b/>
+              </w:rPr>
+              <w:t>Contrast</w:t>
             </w:r>
           </w:p>
         </w:tc>
         <w:tc>
           <w:tcPr>
             <w:tcW w:type="dxa" w:w="2412"/>
+            <w:vAlign w:val="center"/>
           </w:tcPr>
           <w:p>
             <w:r>
-              <w:t>Trials</w:t>
+              <w:rPr>
+                <w:b/>
+              </w:rPr>
+              <w:t>OR</w:t>
             </w:r>
           </w:p>
         </w:tc>
         <w:tc>
           <w:tcPr>
             <w:tcW w:type="dxa" w:w="2412"/>
+            <w:vAlign w:val="center"/>
           </w:tcPr>
           <w:p>
             <w:r>
-              <w:t>Accuracy</w:t>
+              <w:rPr>
+                <w:b/>
+              </w:rPr>
+              <w:t>95% CI</w:t>
             </w:r>
           </w:p>
         </w:tc>
         <w:tc>
           <w:tcPr>
             <w:tcW w:type="dxa" w:w="2412"/>
+            <w:vAlign w:val="center"/>
           </w:tcPr>
           <w:p>
             <w:r>
-              <w:t>SD</w:t>
+              <w:rPr>
+                <w:b/>
+              </w:rPr>
+              <w:t>p</w:t>
             </w:r>
           </w:p>
         </w:tc>
@@ -220,205 +536,7 @@
         <w:tc>
           <w:tcPr>
             <w:tcW w:type="dxa" w:w="2412"/>
-          </w:tcPr>
-          <w:p>
-            <w:r>
-              <w:t>Negative</w:t>
-            </w:r>
-          </w:p>
-        </w:tc>
-        <w:tc>
-          <w:tcPr>
-            <w:tcW w:type="dxa" w:w="2412"/>
-          </w:tcPr>
-          <w:p>
-            <w:r>
-              <w:t>5940</w:t>
-            </w:r>
-          </w:p>
-        </w:tc>
-        <w:tc>
-          <w:tcPr>
-            <w:tcW w:type="dxa" w:w="2412"/>
-          </w:tcPr>
-          <w:p>
-            <w:r>
-              <w:t>83.8%</w:t>
-            </w:r>
-          </w:p>
-        </w:tc>
-        <w:tc>
-          <w:tcPr>
-            <w:tcW w:type="dxa" w:w="2412"/>
-          </w:tcPr>
-          <w:p>
-            <w:r>
-              <w:t>0.368</w:t>
-            </w:r>
-          </w:p>
-        </w:tc>
-      </w:tr>
-      <w:tr>
-        <w:tc>
-          <w:tcPr>
-            <w:tcW w:type="dxa" w:w="2412"/>
-          </w:tcPr>
-          <w:p>
-            <w:r>
-              <w:t>Neutral</w:t>
-            </w:r>
-          </w:p>
-        </w:tc>
-        <w:tc>
-          <w:tcPr>
-            <w:tcW w:type="dxa" w:w="2412"/>
-          </w:tcPr>
-          <w:p>
-            <w:r>
-              <w:t>5940</w:t>
-            </w:r>
-          </w:p>
-        </w:tc>
-        <w:tc>
-          <w:tcPr>
-            <w:tcW w:type="dxa" w:w="2412"/>
-          </w:tcPr>
-          <w:p>
-            <w:r>
-              <w:t>85.0%</w:t>
-            </w:r>
-          </w:p>
-        </w:tc>
-        <w:tc>
-          <w:tcPr>
-            <w:tcW w:type="dxa" w:w="2412"/>
-          </w:tcPr>
-          <w:p>
-            <w:r>
-              <w:t>0.357</w:t>
-            </w:r>
-          </w:p>
-        </w:tc>
-      </w:tr>
-      <w:tr>
-        <w:tc>
-          <w:tcPr>
-            <w:tcW w:type="dxa" w:w="2412"/>
-          </w:tcPr>
-          <w:p>
-            <w:r>
-              <w:t>Positive</w:t>
-            </w:r>
-          </w:p>
-        </w:tc>
-        <w:tc>
-          <w:tcPr>
-            <w:tcW w:type="dxa" w:w="2412"/>
-          </w:tcPr>
-          <w:p>
-            <w:r>
-              <w:t>5940</w:t>
-            </w:r>
-          </w:p>
-        </w:tc>
-        <w:tc>
-          <w:tcPr>
-            <w:tcW w:type="dxa" w:w="2412"/>
-          </w:tcPr>
-          <w:p>
-            <w:r>
-              <w:t>85.1%</w:t>
-            </w:r>
-          </w:p>
-        </w:tc>
-        <w:tc>
-          <w:tcPr>
-            <w:tcW w:type="dxa" w:w="2412"/>
-          </w:tcPr>
-          <w:p>
-            <w:r>
-              <w:t>0.356</w:t>
-            </w:r>
-          </w:p>
-        </w:tc>
-      </w:tr>
-    </w:tbl>
-    <w:p/>
-    <w:p>
-      <w:r>
-        <w:t>Table 2. GEE estimates for response accuracy.</w:t>
-      </w:r>
-    </w:p>
-    <w:tbl>
-      <w:tblPr>
-        <w:tblStyle w:val="TableGrid"/>
-        <w:tblW w:type="auto" w:w="0"/>
-        <w:jc w:val="center"/>
-        <w:tblLook w:firstColumn="1" w:firstRow="1" w:lastColumn="0" w:lastRow="0" w:noHBand="0" w:noVBand="1" w:val="04A0"/>
-      </w:tblPr>
-      <w:tblGrid>
-        <w:gridCol w:w="1930"/>
-        <w:gridCol w:w="1930"/>
-        <w:gridCol w:w="1930"/>
-        <w:gridCol w:w="1930"/>
-        <w:gridCol w:w="1930"/>
-      </w:tblGrid>
-      <w:tr>
-        <w:tc>
-          <w:tcPr>
-            <w:tcW w:type="dxa" w:w="1930"/>
-          </w:tcPr>
-          <w:p>
-            <w:r>
-              <w:t>Contrast</w:t>
-            </w:r>
-          </w:p>
-        </w:tc>
-        <w:tc>
-          <w:tcPr>
-            <w:tcW w:type="dxa" w:w="1930"/>
-          </w:tcPr>
-          <w:p>
-            <w:r>
-              <w:t>OR</w:t>
-            </w:r>
-          </w:p>
-        </w:tc>
-        <w:tc>
-          <w:tcPr>
-            <w:tcW w:type="dxa" w:w="1930"/>
-          </w:tcPr>
-          <w:p>
-            <w:r>
-              <w:t>95% CI lower</w:t>
-            </w:r>
-          </w:p>
-        </w:tc>
-        <w:tc>
-          <w:tcPr>
-            <w:tcW w:type="dxa" w:w="1930"/>
-          </w:tcPr>
-          <w:p>
-            <w:r>
-              <w:t>95% CI upper</w:t>
-            </w:r>
-          </w:p>
-        </w:tc>
-        <w:tc>
-          <w:tcPr>
-            <w:tcW w:type="dxa" w:w="1930"/>
-          </w:tcPr>
-          <w:p>
-            <w:r>
-              <w:t>p</w:t>
-            </w:r>
-          </w:p>
-        </w:tc>
-      </w:tr>
-      <w:tr>
-        <w:tc>
-          <w:tcPr>
-            <w:tcW w:type="dxa" w:w="1930"/>
+            <w:vAlign w:val="center"/>
           </w:tcPr>
           <w:p>
             <w:r>
@@ -428,7 +546,8 @@
         </w:tc>
         <w:tc>
           <w:tcPr>
-            <w:tcW w:type="dxa" w:w="1930"/>
+            <w:tcW w:type="dxa" w:w="2412"/>
+            <w:vAlign w:val="center"/>
           </w:tcPr>
           <w:p>
             <w:r>
@@ -438,31 +557,23 @@
         </w:tc>
         <w:tc>
           <w:tcPr>
-            <w:tcW w:type="dxa" w:w="1930"/>
+            <w:tcW w:type="dxa" w:w="2412"/>
+            <w:vAlign w:val="center"/>
           </w:tcPr>
           <w:p>
             <w:r>
-              <w:t>0.81</w:t>
+              <w:t>[0.81, 1.04]</w:t>
             </w:r>
           </w:p>
         </w:tc>
         <w:tc>
           <w:tcPr>
-            <w:tcW w:type="dxa" w:w="1930"/>
+            <w:tcW w:type="dxa" w:w="2412"/>
+            <w:vAlign w:val="center"/>
           </w:tcPr>
           <w:p>
             <w:r>
-              <w:t>1.04</w:t>
-            </w:r>
-          </w:p>
-        </w:tc>
-        <w:tc>
-          <w:tcPr>
-            <w:tcW w:type="dxa" w:w="1930"/>
-          </w:tcPr>
-          <w:p>
-            <w:r>
-              <w:t>= 0.189</w:t>
+              <w:t>= .189</w:t>
             </w:r>
           </w:p>
         </w:tc>
@@ -470,7 +581,8 @@
       <w:tr>
         <w:tc>
           <w:tcPr>
-            <w:tcW w:type="dxa" w:w="1930"/>
+            <w:tcW w:type="dxa" w:w="2412"/>
+            <w:vAlign w:val="center"/>
           </w:tcPr>
           <w:p>
             <w:r>
@@ -480,7 +592,8 @@
         </w:tc>
         <w:tc>
           <w:tcPr>
-            <w:tcW w:type="dxa" w:w="1930"/>
+            <w:tcW w:type="dxa" w:w="2412"/>
+            <w:vAlign w:val="center"/>
           </w:tcPr>
           <w:p>
             <w:r>
@@ -490,36 +603,29 @@
         </w:tc>
         <w:tc>
           <w:tcPr>
-            <w:tcW w:type="dxa" w:w="1930"/>
+            <w:tcW w:type="dxa" w:w="2412"/>
+            <w:vAlign w:val="center"/>
           </w:tcPr>
           <w:p>
             <w:r>
-              <w:t>0.90</w:t>
+              <w:t>[0.90, 1.12]</w:t>
             </w:r>
           </w:p>
         </w:tc>
         <w:tc>
           <w:tcPr>
-            <w:tcW w:type="dxa" w:w="1930"/>
+            <w:tcW w:type="dxa" w:w="2412"/>
+            <w:vAlign w:val="center"/>
           </w:tcPr>
           <w:p>
             <w:r>
-              <w:t>1.12</w:t>
-            </w:r>
-          </w:p>
-        </w:tc>
-        <w:tc>
-          <w:tcPr>
-            <w:tcW w:type="dxa" w:w="1930"/>
-          </w:tcPr>
-          <w:p>
-            <w:r>
-              <w:t>= 0.979</w:t>
+              <w:t>= .979</w:t>
             </w:r>
           </w:p>
         </w:tc>
       </w:tr>
     </w:tbl>
+    <w:p/>
     <w:p>
       <w:pPr>
         <w:pStyle w:val="Heading2"/>
@@ -530,53 +636,27 @@
     </w:p>
     <w:p>
       <w:r>
-        <w:t>In contrast to accuracy, emotional condition was strongly associated with</w:t>
-        <w:br/>
-        <w:t>reaction time.</w:t>
+        <w:t>In contrast to accuracy, emotional condition was strongly associated with reaction time.</w:t>
       </w:r>
     </w:p>
     <w:p>
       <w:r>
-        <w:t>Relative to the neutral condition, the negative emotional condition was</w:t>
-        <w:br/>
-        <w:t>associated with a significantly lower log reaction time</w:t>
-        <w:br/>
-        <w:t>(beta = -0.265, SE = 0.015, z = -17.29, p &lt; .001,</w:t>
-        <w:br/>
-        <w:t>95% CI [-0.295, -0.235]). After back-transformation, this coefficient</w:t>
-        <w:br/>
-        <w:t>corresponds to an estimated 23.3% reduction in reaction time relative to</w:t>
-        <w:br/>
-        <w:t>the neutral condition (approximately 20.9% to 25.5% lower).</w:t>
+        <w:t>Relative to the neutral condition, the negative emotional condition was associated with a significantly lower log reaction time (beta = -0.265, SE = 0.015, z = -17.29, p &lt; .001). After back-transformation, this coefficient corresponded to an estimated 23.3% reduction in reaction time relative to the neutral condition.</w:t>
       </w:r>
     </w:p>
     <w:p>
       <w:r>
-        <w:t>The positive emotional condition was also associated with a significantly</w:t>
-        <w:br/>
-        <w:t>lower log reaction time compared with the neutral condition</w:t>
-        <w:br/>
-        <w:t>(beta = -0.285, SE = 0.015, z = -18.60, p &lt; .001,</w:t>
-        <w:br/>
-        <w:t>95% CI [-0.316, -0.255]). This corresponds to an estimated 24.8%</w:t>
-        <w:br/>
-        <w:t>reduction in reaction time relative to neutral</w:t>
-        <w:br/>
-        <w:t>(approximately 22.5% to 27.1% lower).</w:t>
+        <w:t>The positive emotional condition was also associated with a significantly lower log reaction time compared with the neutral condition (beta = -0.285, SE = 0.015, z = -18.60, p &lt; .001). This corresponds to an estimated 24.8% reduction in reaction time relative to neutral.</w:t>
       </w:r>
     </w:p>
     <w:p>
       <w:r>
-        <w:t>The magnitude of the positive and negative coefficients was similar,</w:t>
-        <w:br/>
-        <w:t>suggesting that both emotionally induced conditions were associated with</w:t>
-        <w:br/>
-        <w:t>faster responses compared with the neutral baseline.</w:t>
+        <w:t>The magnitude of the positive and negative coefficients was similar, suggesting that both emotionally induced conditions were associated with faster responses compared with the neutral baseline.</w:t>
       </w:r>
     </w:p>
     <w:p>
       <w:r>
-        <w:t>Table 3. Mixed-effects model estimates for log reaction time.</w:t>
+        <w:t>Table 3. Descriptive reaction time by emotional condition.</w:t>
       </w:r>
     </w:p>
     <w:tbl>
@@ -598,59 +678,380 @@
         <w:tc>
           <w:tcPr>
             <w:tcW w:type="dxa" w:w="1608"/>
+            <w:vAlign w:val="center"/>
           </w:tcPr>
           <w:p>
             <w:r>
+              <w:rPr>
+                <w:b/>
+              </w:rPr>
+              <w:t>Condition</w:t>
+            </w:r>
+          </w:p>
+        </w:tc>
+        <w:tc>
+          <w:tcPr>
+            <w:tcW w:type="dxa" w:w="1608"/>
+            <w:vAlign w:val="center"/>
+          </w:tcPr>
+          <w:p>
+            <w:r>
+              <w:rPr>
+                <w:b/>
+              </w:rPr>
+              <w:t>Participants</w:t>
+            </w:r>
+          </w:p>
+        </w:tc>
+        <w:tc>
+          <w:tcPr>
+            <w:tcW w:type="dxa" w:w="1608"/>
+            <w:vAlign w:val="center"/>
+          </w:tcPr>
+          <w:p>
+            <w:r>
+              <w:rPr>
+                <w:b/>
+              </w:rPr>
+              <w:t>Trials</w:t>
+            </w:r>
+          </w:p>
+        </w:tc>
+        <w:tc>
+          <w:tcPr>
+            <w:tcW w:type="dxa" w:w="1608"/>
+            <w:vAlign w:val="center"/>
+          </w:tcPr>
+          <w:p>
+            <w:r>
+              <w:rPr>
+                <w:b/>
+              </w:rPr>
+              <w:t>Mean RT</w:t>
+            </w:r>
+          </w:p>
+        </w:tc>
+        <w:tc>
+          <w:tcPr>
+            <w:tcW w:type="dxa" w:w="1608"/>
+            <w:vAlign w:val="center"/>
+          </w:tcPr>
+          <w:p>
+            <w:r>
+              <w:rPr>
+                <w:b/>
+              </w:rPr>
+              <w:t>Median RT</w:t>
+            </w:r>
+          </w:p>
+        </w:tc>
+        <w:tc>
+          <w:tcPr>
+            <w:tcW w:type="dxa" w:w="1608"/>
+            <w:vAlign w:val="center"/>
+          </w:tcPr>
+          <w:p>
+            <w:r>
+              <w:rPr>
+                <w:b/>
+              </w:rPr>
+              <w:t>SD</w:t>
+            </w:r>
+          </w:p>
+        </w:tc>
+      </w:tr>
+      <w:tr>
+        <w:tc>
+          <w:tcPr>
+            <w:tcW w:type="dxa" w:w="1608"/>
+            <w:vAlign w:val="center"/>
+          </w:tcPr>
+          <w:p>
+            <w:r>
+              <w:t>Negative</w:t>
+            </w:r>
+          </w:p>
+        </w:tc>
+        <w:tc>
+          <w:tcPr>
+            <w:tcW w:type="dxa" w:w="1608"/>
+            <w:vAlign w:val="center"/>
+          </w:tcPr>
+          <w:p>
+            <w:r>
+              <w:t>22</w:t>
+            </w:r>
+          </w:p>
+        </w:tc>
+        <w:tc>
+          <w:tcPr>
+            <w:tcW w:type="dxa" w:w="1608"/>
+            <w:vAlign w:val="center"/>
+          </w:tcPr>
+          <w:p>
+            <w:r>
+              <w:t>4704</w:t>
+            </w:r>
+          </w:p>
+        </w:tc>
+        <w:tc>
+          <w:tcPr>
+            <w:tcW w:type="dxa" w:w="1608"/>
+            <w:vAlign w:val="center"/>
+          </w:tcPr>
+          <w:p>
+            <w:r>
+              <w:t>740.25</w:t>
+            </w:r>
+          </w:p>
+        </w:tc>
+        <w:tc>
+          <w:tcPr>
+            <w:tcW w:type="dxa" w:w="1608"/>
+            <w:vAlign w:val="center"/>
+          </w:tcPr>
+          <w:p>
+            <w:r>
+              <w:t>433.50</w:t>
+            </w:r>
+          </w:p>
+        </w:tc>
+        <w:tc>
+          <w:tcPr>
+            <w:tcW w:type="dxa" w:w="1608"/>
+            <w:vAlign w:val="center"/>
+          </w:tcPr>
+          <w:p>
+            <w:r>
+              <w:t>744.23</w:t>
+            </w:r>
+          </w:p>
+        </w:tc>
+      </w:tr>
+      <w:tr>
+        <w:tc>
+          <w:tcPr>
+            <w:tcW w:type="dxa" w:w="1608"/>
+            <w:vAlign w:val="center"/>
+          </w:tcPr>
+          <w:p>
+            <w:r>
+              <w:t>Neutral</w:t>
+            </w:r>
+          </w:p>
+        </w:tc>
+        <w:tc>
+          <w:tcPr>
+            <w:tcW w:type="dxa" w:w="1608"/>
+            <w:vAlign w:val="center"/>
+          </w:tcPr>
+          <w:p>
+            <w:r>
+              <w:t>23</w:t>
+            </w:r>
+          </w:p>
+        </w:tc>
+        <w:tc>
+          <w:tcPr>
+            <w:tcW w:type="dxa" w:w="1608"/>
+            <w:vAlign w:val="center"/>
+          </w:tcPr>
+          <w:p>
+            <w:r>
+              <w:t>4829</w:t>
+            </w:r>
+          </w:p>
+        </w:tc>
+        <w:tc>
+          <w:tcPr>
+            <w:tcW w:type="dxa" w:w="1608"/>
+            <w:vAlign w:val="center"/>
+          </w:tcPr>
+          <w:p>
+            <w:r>
+              <w:t>966.58</w:t>
+            </w:r>
+          </w:p>
+        </w:tc>
+        <w:tc>
+          <w:tcPr>
+            <w:tcW w:type="dxa" w:w="1608"/>
+            <w:vAlign w:val="center"/>
+          </w:tcPr>
+          <w:p>
+            <w:r>
+              <w:t>630.00</w:t>
+            </w:r>
+          </w:p>
+        </w:tc>
+        <w:tc>
+          <w:tcPr>
+            <w:tcW w:type="dxa" w:w="1608"/>
+            <w:vAlign w:val="center"/>
+          </w:tcPr>
+          <w:p>
+            <w:r>
+              <w:t>896.36</w:t>
+            </w:r>
+          </w:p>
+        </w:tc>
+      </w:tr>
+      <w:tr>
+        <w:tc>
+          <w:tcPr>
+            <w:tcW w:type="dxa" w:w="1608"/>
+            <w:vAlign w:val="center"/>
+          </w:tcPr>
+          <w:p>
+            <w:r>
+              <w:t>Positive</w:t>
+            </w:r>
+          </w:p>
+        </w:tc>
+        <w:tc>
+          <w:tcPr>
+            <w:tcW w:type="dxa" w:w="1608"/>
+            <w:vAlign w:val="center"/>
+          </w:tcPr>
+          <w:p>
+            <w:r>
+              <w:t>22</w:t>
+            </w:r>
+          </w:p>
+        </w:tc>
+        <w:tc>
+          <w:tcPr>
+            <w:tcW w:type="dxa" w:w="1608"/>
+            <w:vAlign w:val="center"/>
+          </w:tcPr>
+          <w:p>
+            <w:r>
+              <w:t>4651</w:t>
+            </w:r>
+          </w:p>
+        </w:tc>
+        <w:tc>
+          <w:tcPr>
+            <w:tcW w:type="dxa" w:w="1608"/>
+            <w:vAlign w:val="center"/>
+          </w:tcPr>
+          <w:p>
+            <w:r>
+              <w:t>771.33</w:t>
+            </w:r>
+          </w:p>
+        </w:tc>
+        <w:tc>
+          <w:tcPr>
+            <w:tcW w:type="dxa" w:w="1608"/>
+            <w:vAlign w:val="center"/>
+          </w:tcPr>
+          <w:p>
+            <w:r>
+              <w:t>421.00</w:t>
+            </w:r>
+          </w:p>
+        </w:tc>
+        <w:tc>
+          <w:tcPr>
+            <w:tcW w:type="dxa" w:w="1608"/>
+            <w:vAlign w:val="center"/>
+          </w:tcPr>
+          <w:p>
+            <w:r>
+              <w:t>808.86</w:t>
+            </w:r>
+          </w:p>
+        </w:tc>
+      </w:tr>
+    </w:tbl>
+    <w:p/>
+    <w:p>
+      <w:r>
+        <w:t>Table 4. Mixed-effects model estimates for log reaction time.</w:t>
+      </w:r>
+    </w:p>
+    <w:tbl>
+      <w:tblPr>
+        <w:tblStyle w:val="TableGrid"/>
+        <w:tblW w:type="auto" w:w="0"/>
+        <w:jc w:val="center"/>
+        <w:tblLook w:firstColumn="1" w:firstRow="1" w:lastColumn="0" w:lastRow="0" w:noHBand="0" w:noVBand="1" w:val="04A0"/>
+      </w:tblPr>
+      <w:tblGrid>
+        <w:gridCol w:w="1930"/>
+        <w:gridCol w:w="1930"/>
+        <w:gridCol w:w="1930"/>
+        <w:gridCol w:w="1930"/>
+        <w:gridCol w:w="1930"/>
+      </w:tblGrid>
+      <w:tr>
+        <w:tc>
+          <w:tcPr>
+            <w:tcW w:type="dxa" w:w="1930"/>
+            <w:vAlign w:val="center"/>
+          </w:tcPr>
+          <w:p>
+            <w:r>
+              <w:rPr>
+                <w:b/>
+              </w:rPr>
               <w:t>Contrast</w:t>
             </w:r>
           </w:p>
         </w:tc>
         <w:tc>
           <w:tcPr>
-            <w:tcW w:type="dxa" w:w="1608"/>
+            <w:tcW w:type="dxa" w:w="1930"/>
+            <w:vAlign w:val="center"/>
           </w:tcPr>
           <w:p>
             <w:r>
+              <w:rPr>
+                <w:b/>
+              </w:rPr>
               <w:t>Beta</w:t>
             </w:r>
           </w:p>
         </w:tc>
         <w:tc>
           <w:tcPr>
-            <w:tcW w:type="dxa" w:w="1608"/>
+            <w:tcW w:type="dxa" w:w="1930"/>
+            <w:vAlign w:val="center"/>
           </w:tcPr>
           <w:p>
             <w:r>
+              <w:rPr>
+                <w:b/>
+              </w:rPr>
               <w:t>RT change</w:t>
             </w:r>
           </w:p>
         </w:tc>
         <w:tc>
           <w:tcPr>
-            <w:tcW w:type="dxa" w:w="1608"/>
+            <w:tcW w:type="dxa" w:w="1930"/>
+            <w:vAlign w:val="center"/>
           </w:tcPr>
           <w:p>
             <w:r>
-              <w:t>95% CI lower</w:t>
+              <w:rPr>
+                <w:b/>
+              </w:rPr>
+              <w:t>95% CI</w:t>
             </w:r>
           </w:p>
         </w:tc>
         <w:tc>
           <w:tcPr>
-            <w:tcW w:type="dxa" w:w="1608"/>
+            <w:tcW w:type="dxa" w:w="1930"/>
+            <w:vAlign w:val="center"/>
           </w:tcPr>
           <w:p>
             <w:r>
-              <w:t>95% CI upper</w:t>
-            </w:r>
-          </w:p>
-        </w:tc>
-        <w:tc>
-          <w:tcPr>
-            <w:tcW w:type="dxa" w:w="1608"/>
-          </w:tcPr>
-          <w:p>
-            <w:r>
+              <w:rPr>
+                <w:b/>
+              </w:rPr>
               <w:t>p</w:t>
             </w:r>
           </w:p>
@@ -659,7 +1060,8 @@
       <w:tr>
         <w:tc>
           <w:tcPr>
-            <w:tcW w:type="dxa" w:w="1608"/>
+            <w:tcW w:type="dxa" w:w="1930"/>
+            <w:vAlign w:val="center"/>
           </w:tcPr>
           <w:p>
             <w:r>
@@ -669,7 +1071,8 @@
         </w:tc>
         <w:tc>
           <w:tcPr>
-            <w:tcW w:type="dxa" w:w="1608"/>
+            <w:tcW w:type="dxa" w:w="1930"/>
+            <w:vAlign w:val="center"/>
           </w:tcPr>
           <w:p>
             <w:r>
@@ -679,7 +1082,8 @@
         </w:tc>
         <w:tc>
           <w:tcPr>
-            <w:tcW w:type="dxa" w:w="1608"/>
+            <w:tcW w:type="dxa" w:w="1930"/>
+            <w:vAlign w:val="center"/>
           </w:tcPr>
           <w:p>
             <w:r>
@@ -689,27 +1093,19 @@
         </w:tc>
         <w:tc>
           <w:tcPr>
-            <w:tcW w:type="dxa" w:w="1608"/>
+            <w:tcW w:type="dxa" w:w="1930"/>
+            <w:vAlign w:val="center"/>
           </w:tcPr>
           <w:p>
             <w:r>
-              <w:t>-25.5%</w:t>
+              <w:t>[-25.5%, -20.9%]</w:t>
             </w:r>
           </w:p>
         </w:tc>
         <w:tc>
           <w:tcPr>
-            <w:tcW w:type="dxa" w:w="1608"/>
-          </w:tcPr>
-          <w:p>
-            <w:r>
-              <w:t>-20.9%</w:t>
-            </w:r>
-          </w:p>
-        </w:tc>
-        <w:tc>
-          <w:tcPr>
-            <w:tcW w:type="dxa" w:w="1608"/>
+            <w:tcW w:type="dxa" w:w="1930"/>
+            <w:vAlign w:val="center"/>
           </w:tcPr>
           <w:p>
             <w:r>
@@ -721,7 +1117,8 @@
       <w:tr>
         <w:tc>
           <w:tcPr>
-            <w:tcW w:type="dxa" w:w="1608"/>
+            <w:tcW w:type="dxa" w:w="1930"/>
+            <w:vAlign w:val="center"/>
           </w:tcPr>
           <w:p>
             <w:r>
@@ -731,7 +1128,8 @@
         </w:tc>
         <w:tc>
           <w:tcPr>
-            <w:tcW w:type="dxa" w:w="1608"/>
+            <w:tcW w:type="dxa" w:w="1930"/>
+            <w:vAlign w:val="center"/>
           </w:tcPr>
           <w:p>
             <w:r>
@@ -741,7 +1139,8 @@
         </w:tc>
         <w:tc>
           <w:tcPr>
-            <w:tcW w:type="dxa" w:w="1608"/>
+            <w:tcW w:type="dxa" w:w="1930"/>
+            <w:vAlign w:val="center"/>
           </w:tcPr>
           <w:p>
             <w:r>
@@ -751,27 +1150,19 @@
         </w:tc>
         <w:tc>
           <w:tcPr>
-            <w:tcW w:type="dxa" w:w="1608"/>
+            <w:tcW w:type="dxa" w:w="1930"/>
+            <w:vAlign w:val="center"/>
           </w:tcPr>
           <w:p>
             <w:r>
-              <w:t>-27.1%</w:t>
+              <w:t>[-27.1%, -22.5%]</w:t>
             </w:r>
           </w:p>
         </w:tc>
         <w:tc>
           <w:tcPr>
-            <w:tcW w:type="dxa" w:w="1608"/>
-          </w:tcPr>
-          <w:p>
-            <w:r>
-              <w:t>-22.5%</w:t>
-            </w:r>
-          </w:p>
-        </w:tc>
-        <w:tc>
-          <w:tcPr>
-            <w:tcW w:type="dxa" w:w="1608"/>
+            <w:tcW w:type="dxa" w:w="1930"/>
+            <w:vAlign w:val="center"/>
           </w:tcPr>
           <w:p>
             <w:r>
@@ -781,43 +1172,37 @@
         </w:tc>
       </w:tr>
     </w:tbl>
+    <w:p/>
     <w:p>
       <w:pPr>
         <w:pStyle w:val="Heading1"/>
       </w:pPr>
       <w:r>
-        <w:t>Decision rules</w:t>
+        <w:t>Decision Rules</w:t>
       </w:r>
     </w:p>
     <w:p>
+      <w:pPr>
+        <w:pStyle w:val="ListBullet"/>
+      </w:pPr>
       <w:r>
-        <w:br/>
-        <w:t>H1 supported</w:t>
-        <w:br/>
-        <w:t xml:space="preserve">    if there is clear evidence of differences</w:t>
-        <w:br/>
-        <w:t xml:space="preserve">    between emotional conditions in accuracy,</w:t>
-        <w:br/>
-        <w:t xml:space="preserve">    RT, or both.</w:t>
+        <w:t>H1 is supported if there is clear evidence of differences between emotional conditions in accuracy, reaction time, or both.</w:t>
       </w:r>
     </w:p>
     <w:p>
+      <w:pPr>
+        <w:pStyle w:val="ListBullet"/>
+      </w:pPr>
       <w:r>
-        <w:t>H1 partially supported</w:t>
-        <w:br/>
-        <w:t xml:space="preserve">    if differences arise in only one outcome</w:t>
-        <w:br/>
-        <w:t xml:space="preserve">    or in only one specific contrast.</w:t>
+        <w:t>H1 is partially supported if differences arise in only one outcome or in only one specific contrast.</w:t>
       </w:r>
     </w:p>
     <w:p>
+      <w:pPr>
+        <w:pStyle w:val="ListBullet"/>
+      </w:pPr>
       <w:r>
-        <w:t>H1 not supported</w:t>
-        <w:br/>
-        <w:t xml:space="preserve">    if there is no evidence of relevant differences</w:t>
-        <w:br/>
-        <w:t xml:space="preserve">    between conditions.</w:t>
-        <w:br/>
+        <w:t>H1 is not supported if there is no evidence of relevant differences between conditions.</w:t>
       </w:r>
     </w:p>
     <w:p>
@@ -835,50 +1220,22 @@
     </w:p>
     <w:p>
       <w:r>
-        <w:t>The emotional manipulation did not produce statistically detectable</w:t>
-        <w:br/>
-        <w:t>differences in response accuracy. Accuracy remained approximately 84-85%</w:t>
-        <w:br/>
-        <w:t>across the three emotional conditions, and the global test of emotional</w:t>
-        <w:br/>
-        <w:t>condition was not significant.</w:t>
+        <w:t>The emotional manipulation did not produce statistically detectable differences in response accuracy. Accuracy remained approximately 84-85% across the three emotional conditions.</w:t>
       </w:r>
     </w:p>
     <w:p>
       <w:r>
-        <w:t>However, emotional condition showed a pronounced association with</w:t>
-        <w:br/>
-        <w:t>reaction speed. Both positive and negative emotional conditions were</w:t>
-        <w:br/>
-        <w:t>associated with substantially faster responses than the neutral condition,</w:t>
-        <w:br/>
-        <w:t>with estimated reductions in reaction time of approximately 25%.</w:t>
+        <w:t>However, emotional condition showed a pronounced association with reaction speed. Both positive and negative emotional conditions were associated with substantially faster responses than the neutral condition.</w:t>
       </w:r>
     </w:p>
     <w:p>
       <w:r>
-        <w:t>Importantly, the faster responses under emotional induction were not</w:t>
-        <w:br/>
-        <w:t>accompanied by a statistically significant loss of accuracy. Thus, the</w:t>
-        <w:br/>
-        <w:t>results suggest that emotional induction influenced the speed component</w:t>
-        <w:br/>
-        <w:t>of working-memory performance more strongly than the probability of a</w:t>
-        <w:br/>
-        <w:t>correct response.</w:t>
+        <w:t>Importantly, the faster responses under emotional induction were not accompanied by a statistically significant loss of accuracy. Thus, the results suggest that emotional induction influenced the speed component of working-memory performance more strongly than the probability of a correct response.</w:t>
       </w:r>
     </w:p>
     <w:p>
       <w:r>
-        <w:t>Because both positive and negative conditions showed effects in the same</w:t>
-        <w:br/>
-        <w:t>direction relative to neutral, these results do not yet demonstrate a</w:t>
-        <w:br/>
-        <w:t>valence-specific advantage of positive emotion or a valence-specific</w:t>
-        <w:br/>
-        <w:t>impairment under negative emotion. Those directional predictions should</w:t>
-        <w:br/>
-        <w:t>be evaluated through the planned contrasts in Hypotheses 2 and 3.</w:t>
+        <w:t>Because both positive and negative conditions showed effects in the same direction relative to neutral, these results do not demonstrate a valence-specific advantage of positive emotion or a valence-specific impairment under negative emotion. Those directional predictions are evaluated in Hypotheses 2 and 3.</w:t>
       </w:r>
     </w:p>
     <w:p>
@@ -891,13 +1248,7 @@
     </w:p>
     <w:p>
       <w:r>
-        <w:rPr>
-          <w:b/>
-        </w:rPr>
-        <w:t xml:space="preserve">Conclusion: </w:t>
-      </w:r>
-      <w:r>
-        <w:t>Hypothesis 1 was partially supported. Emotional condition did not significantly affect accuracy, but both positive and negative emotional conditions were associated with substantially faster reaction times relative to the neutral condition.</w:t>
+        <w:t>Conclusion: Hypothesis 1 was partially supported. Emotional condition did not significantly affect accuracy, but both positive and negative emotional conditions were associated with substantially faster reaction times relative to the neutral condition.</w:t>
       </w:r>
     </w:p>
     <w:sectPr>
@@ -1385,10 +1736,11 @@
       <w:outlineLvl w:val="2"/>
     </w:pPr>
     <w:rPr>
-      <w:rFonts w:asciiTheme="majorHAnsi" w:eastAsiaTheme="majorEastAsia" w:hAnsiTheme="majorHAnsi" w:cstheme="majorBidi"/>
+      <w:rFonts w:asciiTheme="majorHAnsi" w:eastAsiaTheme="majorEastAsia" w:hAnsiTheme="majorHAnsi" w:cstheme="majorBidi" w:ascii="Arial" w:hAnsi="Arial"/>
       <w:b/>
       <w:bCs/>
       <w:color w:val="4F81BD" w:themeColor="accent1"/>
+      <w:sz w:val="22"/>
     </w:rPr>
   </w:style>
   <w:style w:type="paragraph" w:styleId="Heading4">

</xml_diff>